<commit_message>
fix: updates on references
</commit_message>
<xml_diff>
--- a/Abdulameen Chapter 1 -3.docx
+++ b/Abdulameen Chapter 1 -3.docx
@@ -354,7 +354,14 @@
           <w:rFonts w:ascii="Times New Roman" w:eastAsia="Times New Roman" w:hAnsi="Times New Roman" w:cs="Times New Roman"/>
           <w:color w:val="000000" w:themeColor="text1"/>
         </w:rPr>
-        <w:t>Capital markets play a crucial role in national economic development as they provide the mechanism for listed companies to raise capital and investors to allocate capital to optimal uses (</w:t>
+        <w:t xml:space="preserve">Capital markets play a crucial role in national economic development as they provide the mechanism for listed companies to raise capital and investors to allocate capital to optimal uses </w:t>
+      </w:r>
+      <w:r>
+        <w:rPr>
+          <w:rFonts w:ascii="Times New Roman" w:eastAsia="Times New Roman" w:hAnsi="Times New Roman" w:cs="Times New Roman"/>
+          <w:color w:val="000000" w:themeColor="text1"/>
+        </w:rPr>
+        <w:t>(</w:t>
       </w:r>
       <w:proofErr w:type="spellStart"/>
       <w:r>
@@ -370,23 +377,14 @@
           <w:rFonts w:ascii="Times New Roman" w:eastAsia="Times New Roman" w:hAnsi="Times New Roman" w:cs="Times New Roman"/>
           <w:color w:val="000000" w:themeColor="text1"/>
         </w:rPr>
-        <w:t xml:space="preserve">, 2023; </w:t>
-      </w:r>
-      <w:proofErr w:type="spellStart"/>
-      <w:r>
-        <w:rPr>
-          <w:rFonts w:ascii="Times New Roman" w:eastAsia="Times New Roman" w:hAnsi="Times New Roman" w:cs="Times New Roman"/>
-          <w:color w:val="000000" w:themeColor="text1"/>
-        </w:rPr>
-        <w:t>Evbuomwan</w:t>
-      </w:r>
-      <w:proofErr w:type="spellEnd"/>
-      <w:r>
-        <w:rPr>
-          <w:rFonts w:ascii="Times New Roman" w:eastAsia="Times New Roman" w:hAnsi="Times New Roman" w:cs="Times New Roman"/>
-          <w:color w:val="000000" w:themeColor="text1"/>
-        </w:rPr>
-        <w:t xml:space="preserve">, 2024). The stock market </w:t>
+        <w:t>, 2023</w:t>
+      </w:r>
+      <w:r>
+        <w:rPr>
+          <w:rFonts w:ascii="Times New Roman" w:eastAsia="Times New Roman" w:hAnsi="Times New Roman" w:cs="Times New Roman"/>
+          <w:color w:val="000000" w:themeColor="text1"/>
+        </w:rPr>
+        <w:t xml:space="preserve">). The stock market </w:t>
       </w:r>
       <w:r>
         <w:rPr>
@@ -595,7 +593,23 @@
           <w:rFonts w:ascii="Times New Roman" w:eastAsia="Times New Roman" w:hAnsi="Times New Roman" w:cs="Times New Roman"/>
           <w:color w:val="000000" w:themeColor="text1"/>
         </w:rPr>
-        <w:t xml:space="preserve">crisis period favored diversification through a portfolio of stocks and bonds involving equities, commodities, and government securities. As the correlation among markets </w:t>
+        <w:t xml:space="preserve">crisis period favored diversification through a portfolio of stocks and bonds involving equities, commodities, and government securities. As the correlation among markets increases </w:t>
+      </w:r>
+      <w:proofErr w:type="gramStart"/>
+      <w:r>
+        <w:rPr>
+          <w:rFonts w:ascii="Times New Roman" w:eastAsia="Times New Roman" w:hAnsi="Times New Roman" w:cs="Times New Roman"/>
+          <w:color w:val="000000" w:themeColor="text1"/>
+        </w:rPr>
+        <w:t>over  time</w:t>
+      </w:r>
+      <w:proofErr w:type="gramEnd"/>
+      <w:r>
+        <w:rPr>
+          <w:rFonts w:ascii="Times New Roman" w:eastAsia="Times New Roman" w:hAnsi="Times New Roman" w:cs="Times New Roman"/>
+          <w:color w:val="000000" w:themeColor="text1"/>
+        </w:rPr>
+        <w:t xml:space="preserve">, international portfolio diversification remains if investors continuously </w:t>
       </w:r>
       <w:r>
         <w:rPr>
@@ -603,23 +617,7 @@
           <w:color w:val="000000" w:themeColor="text1"/>
         </w:rPr>
         <w:lastRenderedPageBreak/>
-        <w:t xml:space="preserve">increases </w:t>
-      </w:r>
-      <w:proofErr w:type="gramStart"/>
-      <w:r>
-        <w:rPr>
-          <w:rFonts w:ascii="Times New Roman" w:eastAsia="Times New Roman" w:hAnsi="Times New Roman" w:cs="Times New Roman"/>
-          <w:color w:val="000000" w:themeColor="text1"/>
-        </w:rPr>
-        <w:t>over  time</w:t>
-      </w:r>
-      <w:proofErr w:type="gramEnd"/>
-      <w:r>
-        <w:rPr>
-          <w:rFonts w:ascii="Times New Roman" w:eastAsia="Times New Roman" w:hAnsi="Times New Roman" w:cs="Times New Roman"/>
-          <w:color w:val="000000" w:themeColor="text1"/>
-        </w:rPr>
-        <w:t xml:space="preserve">, international portfolio diversification remains if investors continuously measure correlation among these markets so as to create an optimal market combination (Huang </w:t>
+        <w:t xml:space="preserve">measure correlation among these markets so as to create an optimal market combination (Huang </w:t>
       </w:r>
       <w:r>
         <w:rPr>
@@ -949,7 +947,21 @@
           <w:rFonts w:ascii="Times New Roman" w:eastAsia="Times New Roman" w:hAnsi="Times New Roman" w:cs="Times New Roman"/>
           <w:color w:val="000000" w:themeColor="text1"/>
         </w:rPr>
-        <w:t xml:space="preserve"> &amp; Low, 2024). </w:t>
+        <w:t xml:space="preserve"> &amp; Low, 2024). Optimization models provide a structure for an investor's decision</w:t>
+      </w:r>
+      <w:r>
+        <w:rPr>
+          <w:rFonts w:ascii="Times New Roman" w:eastAsia="Times New Roman" w:hAnsi="Times New Roman" w:cs="Times New Roman"/>
+          <w:color w:val="000000" w:themeColor="text1"/>
+        </w:rPr>
+        <w:t>-</w:t>
+      </w:r>
+      <w:r>
+        <w:rPr>
+          <w:rFonts w:ascii="Times New Roman" w:eastAsia="Times New Roman" w:hAnsi="Times New Roman" w:cs="Times New Roman"/>
+          <w:color w:val="000000" w:themeColor="text1"/>
+        </w:rPr>
+        <w:t xml:space="preserve">making and integrate multiple </w:t>
       </w:r>
       <w:r>
         <w:rPr>
@@ -957,21 +969,7 @@
           <w:color w:val="000000" w:themeColor="text1"/>
         </w:rPr>
         <w:lastRenderedPageBreak/>
-        <w:t>Optimization models provide a structure for an investor's decision</w:t>
-      </w:r>
-      <w:r>
-        <w:rPr>
-          <w:rFonts w:ascii="Times New Roman" w:eastAsia="Times New Roman" w:hAnsi="Times New Roman" w:cs="Times New Roman"/>
-          <w:color w:val="000000" w:themeColor="text1"/>
-        </w:rPr>
-        <w:t>-</w:t>
-      </w:r>
-      <w:r>
-        <w:rPr>
-          <w:rFonts w:ascii="Times New Roman" w:eastAsia="Times New Roman" w:hAnsi="Times New Roman" w:cs="Times New Roman"/>
-          <w:color w:val="000000" w:themeColor="text1"/>
-        </w:rPr>
-        <w:t>making and integrate multiple dimensions of risk, including credit, market and liquidity risk, into a single process of making investment decisions rather than relying on traditional methods of diversification (</w:t>
+        <w:t>dimensions of risk, including credit, market and liquidity risk, into a single process of making investment decisions rather than relying on traditional methods of diversification (</w:t>
       </w:r>
       <w:proofErr w:type="spellStart"/>
       <w:r>
@@ -1169,15 +1167,7 @@
           <w:rFonts w:ascii="Times New Roman" w:eastAsia="Times New Roman" w:hAnsi="Times New Roman" w:cs="Times New Roman"/>
           <w:color w:val="000000" w:themeColor="text1"/>
         </w:rPr>
-        <w:t xml:space="preserve">variance portfolio theory remains foundational in finance research, it has practical limitations. One key challenge arises from errors in estimating the expected return vector and covariance matrix, which can lead to portfolios that differ substantially from the true optimum (Job, 2022). A second limitation is that MVO does not account for tail risk. This is because of variance which measures deviation from mean and this can result in huge losses for </w:t>
-      </w:r>
-      <w:r>
-        <w:rPr>
-          <w:rFonts w:ascii="Times New Roman" w:eastAsia="Times New Roman" w:hAnsi="Times New Roman" w:cs="Times New Roman"/>
-          <w:color w:val="000000" w:themeColor="text1"/>
-        </w:rPr>
-        <w:lastRenderedPageBreak/>
-        <w:t xml:space="preserve">investors during extreme events (Wang </w:t>
+        <w:t xml:space="preserve">variance portfolio theory remains foundational in finance research, it has practical limitations. One key challenge arises from errors in estimating the expected return vector and covariance matrix, which can lead to portfolios that differ substantially from the true optimum (Job, 2022). A second limitation is that MVO does not account for tail risk. This is because of variance which measures deviation from mean and this can result in huge losses for investors during extreme events (Wang </w:t>
       </w:r>
       <w:r>
         <w:rPr>
@@ -1193,7 +1183,15 @@
           <w:rFonts w:ascii="Times New Roman" w:eastAsia="Times New Roman" w:hAnsi="Times New Roman" w:cs="Times New Roman"/>
           <w:color w:val="000000" w:themeColor="text1"/>
         </w:rPr>
-        <w:t xml:space="preserve"> 2024) especially in emerging markets which are marked by high volatility, low liquidity and asymmetric information (</w:t>
+        <w:t xml:space="preserve"> 2024) especially in emerging markets which are </w:t>
+      </w:r>
+      <w:r>
+        <w:rPr>
+          <w:rFonts w:ascii="Times New Roman" w:eastAsia="Times New Roman" w:hAnsi="Times New Roman" w:cs="Times New Roman"/>
+          <w:color w:val="000000" w:themeColor="text1"/>
+        </w:rPr>
+        <w:lastRenderedPageBreak/>
+        <w:t>marked by high volatility, low liquidity and asymmetric information (</w:t>
       </w:r>
       <w:proofErr w:type="spellStart"/>
       <w:r>
@@ -1607,15 +1605,7 @@
           <w:rFonts w:ascii="Times New Roman" w:eastAsia="Times New Roman" w:hAnsi="Times New Roman" w:cs="Times New Roman"/>
           <w:color w:val="000000" w:themeColor="text1"/>
         </w:rPr>
-        <w:t xml:space="preserve"> the need for a risk measure to show severity of extreme losses thereby showing the need for a technique that goes </w:t>
-      </w:r>
-      <w:r>
-        <w:rPr>
-          <w:rFonts w:ascii="Times New Roman" w:eastAsia="Times New Roman" w:hAnsi="Times New Roman" w:cs="Times New Roman"/>
-          <w:color w:val="000000" w:themeColor="text1"/>
-        </w:rPr>
-        <w:lastRenderedPageBreak/>
-        <w:t>beyond the traditional measures thereby aiding investors in the construction of a more robust portfolio (Fan, 2020).</w:t>
+        <w:t xml:space="preserve"> the need for a risk measure to show severity of extreme losses thereby showing the need for a technique that goes beyond the traditional measures thereby aiding investors in the construction of a more robust portfolio (Fan, 2020).</w:t>
       </w:r>
     </w:p>
     <w:p>
@@ -1632,6 +1622,7 @@
           <w:rFonts w:ascii="Times New Roman" w:eastAsia="Times New Roman" w:hAnsi="Times New Roman" w:cs="Times New Roman"/>
           <w:color w:val="000000" w:themeColor="text1"/>
         </w:rPr>
+        <w:lastRenderedPageBreak/>
         <w:t>Consequently, portfolio optimization models based solely on historical data can misrepresent future risk, indicating the need for methods that incorporate predictive approaches (</w:t>
       </w:r>
       <w:proofErr w:type="spellStart"/>
@@ -1875,7 +1866,30 @@
           <w:rFonts w:ascii="Times New Roman" w:eastAsia="Times New Roman" w:hAnsi="Times New Roman" w:cs="Times New Roman"/>
           <w:color w:val="000000" w:themeColor="text1"/>
         </w:rPr>
-        <w:t xml:space="preserve">2025; </w:t>
+        <w:t>2025; Kevin</w:t>
+      </w:r>
+      <w:r>
+        <w:rPr>
+          <w:rFonts w:ascii="Times New Roman" w:eastAsia="Times New Roman" w:hAnsi="Times New Roman" w:cs="Times New Roman"/>
+          <w:color w:val="000000" w:themeColor="text1"/>
+        </w:rPr>
+        <w:t xml:space="preserve"> and </w:t>
+      </w:r>
+      <w:proofErr w:type="spellStart"/>
+      <w:r>
+        <w:rPr>
+          <w:rFonts w:ascii="Times New Roman" w:eastAsia="Times New Roman" w:hAnsi="Times New Roman" w:cs="Times New Roman"/>
+          <w:color w:val="000000" w:themeColor="text1"/>
+        </w:rPr>
+        <w:t>Yugopuspito</w:t>
+      </w:r>
+      <w:proofErr w:type="spellEnd"/>
+      <w:r>
+        <w:rPr>
+          <w:rFonts w:ascii="Times New Roman" w:eastAsia="Times New Roman" w:hAnsi="Times New Roman" w:cs="Times New Roman"/>
+          <w:color w:val="000000" w:themeColor="text1"/>
+        </w:rPr>
+        <w:t xml:space="preserve">, 2025). Hence, forecasting models not only assist in estimating predictable </w:t>
       </w:r>
       <w:r>
         <w:rPr>
@@ -1883,30 +1897,7 @@
           <w:color w:val="000000" w:themeColor="text1"/>
         </w:rPr>
         <w:lastRenderedPageBreak/>
-        <w:t>Kevin</w:t>
-      </w:r>
-      <w:r>
-        <w:rPr>
-          <w:rFonts w:ascii="Times New Roman" w:eastAsia="Times New Roman" w:hAnsi="Times New Roman" w:cs="Times New Roman"/>
-          <w:color w:val="000000" w:themeColor="text1"/>
-        </w:rPr>
-        <w:t xml:space="preserve"> and </w:t>
-      </w:r>
-      <w:proofErr w:type="spellStart"/>
-      <w:r>
-        <w:rPr>
-          <w:rFonts w:ascii="Times New Roman" w:eastAsia="Times New Roman" w:hAnsi="Times New Roman" w:cs="Times New Roman"/>
-          <w:color w:val="000000" w:themeColor="text1"/>
-        </w:rPr>
-        <w:t>Yugopuspito</w:t>
-      </w:r>
-      <w:proofErr w:type="spellEnd"/>
-      <w:r>
-        <w:rPr>
-          <w:rFonts w:ascii="Times New Roman" w:eastAsia="Times New Roman" w:hAnsi="Times New Roman" w:cs="Times New Roman"/>
-          <w:color w:val="000000" w:themeColor="text1"/>
-        </w:rPr>
-        <w:t>, 2025). Hence, forecasting models not only assist in estimating predictable risks and rewards but are also helpful in understanding the importance of risk</w:t>
+        <w:t>risks and rewards but are also helpful in understanding the importance of risk</w:t>
       </w:r>
       <w:r>
         <w:rPr>
@@ -10203,7 +10194,16 @@
           <w:rFonts w:ascii="Times New Roman" w:eastAsia="Times New Roman" w:hAnsi="Times New Roman" w:cs="Times New Roman"/>
           <w:color w:val="000000" w:themeColor="text1"/>
         </w:rPr>
-        <w:t xml:space="preserve">adjusted returns (Yan et al., 2020). According to </w:t>
+        <w:t>adjusted returns</w:t>
+      </w:r>
+      <w:bookmarkStart w:id="0" w:name="_GoBack"/>
+      <w:bookmarkEnd w:id="0"/>
+      <w:r>
+        <w:rPr>
+          <w:rFonts w:ascii="Times New Roman" w:eastAsia="Times New Roman" w:hAnsi="Times New Roman" w:cs="Times New Roman"/>
+          <w:color w:val="000000" w:themeColor="text1"/>
+        </w:rPr>
+        <w:t xml:space="preserve">. According to </w:t>
       </w:r>
       <w:proofErr w:type="spellStart"/>
       <w:r>
@@ -11472,16 +11472,7 @@
           <w:rFonts w:ascii="Times New Roman" w:eastAsia="Times New Roman" w:hAnsi="Times New Roman" w:cs="Times New Roman"/>
           <w:color w:val="000000" w:themeColor="text1"/>
         </w:rPr>
-        <w:t>To address these structural violations, Post-Modern Portfolio Theory (PMPT) offers a theoretical solution by redefining risk not as general symmetrical volatility, but specifically as the probability of financial loss, thereb</w:t>
-      </w:r>
-      <w:bookmarkStart w:id="0" w:name="_GoBack"/>
-      <w:bookmarkEnd w:id="0"/>
-      <w:r>
-        <w:rPr>
-          <w:rFonts w:ascii="Times New Roman" w:eastAsia="Times New Roman" w:hAnsi="Times New Roman" w:cs="Times New Roman"/>
-          <w:color w:val="000000" w:themeColor="text1"/>
-        </w:rPr>
-        <w:t>y distinguishing between desirable upside gains and detrimental downside drops (</w:t>
+        <w:t>To address these structural violations, Post-Modern Portfolio Theory (PMPT) offers a theoretical solution by redefining risk not as general symmetrical volatility, but specifically as the probability of financial loss, thereby distinguishing between desirable upside gains and detrimental downside drops (</w:t>
       </w:r>
       <w:proofErr w:type="spellStart"/>
       <w:r>

</xml_diff>

<commit_message>
fix: updaetes on content
</commit_message>
<xml_diff>
--- a/Abdulameen Chapter 1 -3.docx
+++ b/Abdulameen Chapter 1 -3.docx
@@ -3790,7 +3790,23 @@
           <w:rFonts w:ascii="Times New Roman" w:eastAsia="Times New Roman" w:hAnsi="Times New Roman" w:cs="Times New Roman"/>
           <w:color w:val="000000" w:themeColor="text1"/>
         </w:rPr>
-        <w:t>learning models improve the accuracy of stock return forecasts on the NSE?</w:t>
+        <w:t>learning models improve the accuracy of s</w:t>
+      </w:r>
+      <w:r>
+        <w:rPr>
+          <w:rFonts w:ascii="Times New Roman" w:eastAsia="Times New Roman" w:hAnsi="Times New Roman" w:cs="Times New Roman"/>
+          <w:color w:val="000000" w:themeColor="text1"/>
+        </w:rPr>
+        <w:t>tock return forecasts on the NGX</w:t>
+      </w:r>
+      <w:bookmarkStart w:id="0" w:name="_GoBack"/>
+      <w:bookmarkEnd w:id="0"/>
+      <w:r>
+        <w:rPr>
+          <w:rFonts w:ascii="Times New Roman" w:eastAsia="Times New Roman" w:hAnsi="Times New Roman" w:cs="Times New Roman"/>
+          <w:color w:val="000000" w:themeColor="text1"/>
+        </w:rPr>
+        <w:t>?</w:t>
       </w:r>
     </w:p>
     <w:p>
@@ -10196,8 +10212,6 @@
         </w:rPr>
         <w:t>adjusted returns</w:t>
       </w:r>
-      <w:bookmarkStart w:id="0" w:name="_GoBack"/>
-      <w:bookmarkEnd w:id="0"/>
       <w:r>
         <w:rPr>
           <w:rFonts w:ascii="Times New Roman" w:eastAsia="Times New Roman" w:hAnsi="Times New Roman" w:cs="Times New Roman"/>

</xml_diff>

<commit_message>
docs: regenerate all thesis files with final 5 reviewer fixes applied
</commit_message>
<xml_diff>
--- a/Abdulameen Chapter 1 -3.docx
+++ b/Abdulameen Chapter 1 -3.docx
@@ -1764,7 +1764,7 @@
           <w:color w:val="000000"/>
           <w:sz w:val="24"/>
         </w:rPr>
-        <w:t>This study investigates the econometric viability and economic performance of integrating non-linear machine learning return forecasting models with convex Conditional Value-at-Risk (CVaR) portfolio optimization on the Nigerian Exchange Group (NGX). Classical portfolio selection models rooted in Markowitz Mean-Variance Optimization (MVO) operate under the restrictive assumption of Gaussian return distributions and quadratic variance, exposing emerging market investors to severe estimation risk and catastrophic left-tail drawdowns. To address these structural deficiencies, this research deploys a robust quantitative framework evaluating 28 liquid equities from the NGX Pension Index spanning a clean 16-year historical panel from January 2010 through December 2025 (835 weekly observations per asset). Thirteen volume-confirmed technical indicators and autoregressive momentum features were engineered to capture non-linear market interactions without look-ahead bias. Using an Expanding-Window Walk-Forward Validation protocol with 5-fold TimeSeriesSplit cross-validation, Random Forest and eXtreme Gradient Boosting (XGBoost) algorithms were trained and refit quarterly across an out-of-sample test horizon (2021–2025). The resulting dynamic expected return forecasts were incorporated into a coherent linear programming Mean-CVaR optimization model and evaluated against classical MVO, naive 1/N equal weighting, and passive market buy-and-hold indexing across three realistic transaction cost regimes (zero friction, 0.75% institutional PFA brokerage, and 1.50% retail fees). Statistical diagnostic tests (Jarque-Bera and Shapiro-Wilk) conclusively rejected normality across all 28 assets (p &lt; 0.001), exhibiting predominantly positive skewness (cross-sectional mean = +0.54) and excess kurtosis across all 28 assets (ranging from 2.20 to 14.47 among assets unaffected by corporate actions), thereby confirming heavy-tailed, leptokurtic distributions and validating the theoretical necessity of CVaR. While raw point prediction errors (RMSE) hover close to historical baselines due to weekly noise variance, Diebold-Mariano tests confirm that forecast accuracy is statistically indistinguishable from historical baselines across 89.3% of assets (p &gt; 0.05). Directional accuracy averaged 38.1% for Random Forest and 37.8% for XGBoost (against 37.9% for the historical baseline across all 28 assets, where below-50% cross-sectional averages reflect zero-return weeks from forward-filling non-trading periods, while reaching 50.8% on liquid large-caps), driven primarily by the Percentage Price Oscillator, Relative Strength Index, and On-Balance Volume. Under zero fee friction, XGBoost + Mean-CVaR achieved a superior gross Sharpe ratio of 1.52 (42.00% annualized return, -22.09% maximum drawdown) compared to 0.91 for the market index and 0.76 for MVO (unadjusted Ledoit-Wolf circular block bootstrap p = 0.015, marginal after Benjamini–Hochberg FDR correction at q = 0.056 across 18 simultaneous comparisons; +819 basis points Certainty Equivalent Return welfare gain). Crucially, transaction cost sensitivity analysis reveals that the structural CVaR architecture delivers the robustly significant result: under institutional fees, XGB-CVaR's weekly turnover (11.00%) incurs an annual fee drag that renders it significantly inferior to static Historical-CVaR (Sharpe diff -0.25, FDR q = 0.000), while unconstrained MVO collapses under turnover drag (-86.38% drawdown, −64.09% CER utility). Low-turnover Historical-CVaR (0.38% weekly turnover) maintains resilient net Sharpe ratios of 1.48 (retail) and 1.49 (institutional). These findings demonstrate that structural tail-risk architecture (CVaR) plays a far more critical role than predictive model complexity in real-world emerging market wealth preservation.</w:t>
+        <w:t>This study investigates the econometric viability and economic performance of integrating non-linear machine learning return forecasting models with convex Conditional Value-at-Risk (CVaR) portfolio optimization on the Nigerian Exchange Group (NGX). Classical portfolio selection models rooted in Markowitz Mean-Variance Optimization (MVO) operate under the restrictive assumption of Gaussian return distributions and quadratic variance, exposing emerging market investors to severe estimation risk and catastrophic left-tail drawdowns. To address these structural deficiencies, this research deploys a robust quantitative framework evaluating 28 liquid equities from the NGX Pension Index spanning a clean 16-year historical panel from January 2010 through December 2025 (835 weekly observations per asset). Thirteen volume-confirmed technical indicators and autoregressive momentum features were engineered to capture non-linear market interactions without look-ahead bias. Using an Expanding-Window Walk-Forward Validation protocol with 5-fold TimeSeriesSplit cross-validation, Random Forest and eXtreme Gradient Boosting (XGBoost) algorithms were trained and refit quarterly across an out-of-sample test horizon (2021–2025). The resulting dynamic expected return forecasts were incorporated into a coherent linear programming Mean-CVaR optimization model and evaluated against classical MVO, naive 1/N equal weighting, and passive market buy-and-hold indexing across three realistic transaction cost regimes (zero friction, 0.75% institutional PFA brokerage, and 1.50% retail fees). Statistical diagnostic tests (Jarque-Bera and Shapiro-Wilk) conclusively rejected normality across all 28 assets (p &lt; 0.001), exhibiting predominantly positive skewness (cross-sectional mean = +0.54) and excess kurtosis across all 28 assets (ranging from 2.20 to 14.47 among assets unaffected by corporate actions), thereby confirming heavy-tailed, leptokurtic distributions and validating the theoretical necessity of CVaR. While raw point prediction errors (RMSE) hover close to historical baselines due to weekly noise variance, Diebold-Mariano tests confirm that forecast accuracy is statistically indistinguishable from historical baselines across 89.3% of assets (p &gt; 0.05). Directional accuracy averaged 38.1% for Random Forest and 37.8% for XGBoost (against 37.9% for the historical baseline across all 28 assets, where below-50% cross-sectional averages reflect zero-return weeks from forward-filling non-trading periods, while reaching 50.8% on liquid large-caps), driven primarily by the Percentage Price Oscillator, Relative Strength Index, and On-Balance Volume. Under zero fee friction, XGBoost + Mean-CVaR achieved a superior gross Sharpe ratio of 1.52 (42.00% annualized return, -22.09% maximum drawdown) compared to 0.91 for the market index and 0.76 for MVO (unadjusted Ledoit-Wolf circular block bootstrap p = 0.015, marginal after Benjamini–Hochberg FDR correction at q = 0.056 across 18 simultaneous comparisons; +819 basis points Certainty Equivalent Return welfare gain). Crucially, transaction cost sensitivity analysis reveals that the structural CVaR architecture delivers the robustly significant result: under institutional fees, XGB-CVaR's weekly turnover (11.00%) incurs an annual fee drag that renders it significantly inferior to static Historical-CVaR (Sharpe diff -0.25, FDR q = 0.000), while unconstrained MVO collapses under turnover drag (-86.38% drawdown, −64.09% CER utility). Low-turnover Historical-CVaR (0.38% weekly turnover) maintains resilient net Sharpe ratios of 1.48 (retail) and 1.49 (institutional). These findings demonstrate that structural tail-risk architecture (CVaR) plays a far more critical role than predictive model complexity in real-world emerging market wealth preservation. Here γ = 3.0 is the risk-aversion coefficient, consistent with the MVO utility specification.</w:t>
       </w:r>
     </w:p>
     <w:p>
@@ -19044,63 +19044,55 @@
           <w:rFonts w:eastAsia="Times New Roman" w:ascii="Times New Roman" w:hAnsi="Times New Roman"/>
           <w:color w:val="000000" w:themeColor="text1"/>
         </w:rPr>
-        <w:t>Out</w:t>
-      </w:r>
-      <w:r>
-        <w:rPr>
-          <w:rFonts w:eastAsia="Times New Roman" w:ascii="Times New Roman" w:hAnsi="Times New Roman"/>
-          <w:color w:val="000000" w:themeColor="text1"/>
-        </w:rPr>
-        <w:t>-</w:t>
-      </w:r>
-      <w:r>
-        <w:rPr>
-          <w:rFonts w:eastAsia="Times New Roman" w:ascii="Times New Roman" w:hAnsi="Times New Roman"/>
-          <w:color w:val="000000" w:themeColor="text1"/>
-        </w:rPr>
-        <w:t>of</w:t>
-      </w:r>
-      <w:r>
-        <w:rPr>
-          <w:rFonts w:eastAsia="Times New Roman" w:ascii="Times New Roman" w:hAnsi="Times New Roman"/>
-          <w:color w:val="000000" w:themeColor="text1"/>
-        </w:rPr>
-        <w:t>-</w:t>
-      </w:r>
-      <w:r>
-        <w:rPr>
-          <w:rFonts w:eastAsia="Times New Roman" w:ascii="Times New Roman" w:hAnsi="Times New Roman"/>
-          <w:color w:val="000000" w:themeColor="text1"/>
-        </w:rPr>
-        <w:t>the</w:t>
-      </w:r>
-      <w:r>
-        <w:rPr>
-          <w:rFonts w:eastAsia="Times New Roman" w:ascii="Times New Roman" w:hAnsi="Times New Roman"/>
-          <w:color w:val="000000" w:themeColor="text1"/>
-        </w:rPr>
-        <w:t>-</w:t>
-      </w:r>
-      <w:r>
-        <w:rPr>
-          <w:rFonts w:eastAsia="Times New Roman" w:ascii="Times New Roman" w:hAnsi="Times New Roman"/>
-          <w:color w:val="000000" w:themeColor="text1"/>
-        </w:rPr>
-        <w:t>box machine learning algorithms rarely capture the complex dynamics of financial time series optimally. Therefore, this study employs a Randomized Search Cross</w:t>
-      </w:r>
-      <w:r>
-        <w:rPr>
-          <w:rFonts w:eastAsia="Times New Roman" w:ascii="Times New Roman" w:hAnsi="Times New Roman"/>
-          <w:color w:val="000000" w:themeColor="text1"/>
-        </w:rPr>
-        <w:t>-</w:t>
-      </w:r>
-      <w:r>
-        <w:rPr>
-          <w:rFonts w:eastAsia="Times New Roman" w:ascii="Times New Roman" w:hAnsi="Times New Roman"/>
-          <w:color w:val="000000" w:themeColor="text1"/>
-        </w:rPr>
-        <w:t xml:space="preserve">Validation strategy within the training window to efficiently identify the optimal </w:t>
+        <w:t>Hyperparameters were tuned once on the 2010–2020 in-sample period using GridSearchCV with 5-fold TimeSeriesSplit, focusing on parameters that penalize model complexity:</w:t>
+      </w:r>
+      <w:r>
+        <w:rPr>
+          <w:rFonts w:eastAsia="Times New Roman" w:ascii="Times New Roman" w:hAnsi="Times New Roman"/>
+          <w:color w:val="000000" w:themeColor="text1"/>
+        </w:rPr>
+      </w:r>
+      <w:r>
+        <w:rPr>
+          <w:rFonts w:eastAsia="Times New Roman" w:ascii="Times New Roman" w:hAnsi="Times New Roman"/>
+          <w:color w:val="000000" w:themeColor="text1"/>
+        </w:rPr>
+      </w:r>
+      <w:r>
+        <w:rPr>
+          <w:rFonts w:eastAsia="Times New Roman" w:ascii="Times New Roman" w:hAnsi="Times New Roman"/>
+          <w:color w:val="000000" w:themeColor="text1"/>
+        </w:rPr>
+      </w:r>
+      <w:r>
+        <w:rPr>
+          <w:rFonts w:eastAsia="Times New Roman" w:ascii="Times New Roman" w:hAnsi="Times New Roman"/>
+          <w:color w:val="000000" w:themeColor="text1"/>
+        </w:rPr>
+      </w:r>
+      <w:r>
+        <w:rPr>
+          <w:rFonts w:eastAsia="Times New Roman" w:ascii="Times New Roman" w:hAnsi="Times New Roman"/>
+          <w:color w:val="000000" w:themeColor="text1"/>
+        </w:rPr>
+      </w:r>
+      <w:r>
+        <w:rPr>
+          <w:rFonts w:eastAsia="Times New Roman" w:ascii="Times New Roman" w:hAnsi="Times New Roman"/>
+          <w:color w:val="000000" w:themeColor="text1"/>
+        </w:rPr>
+      </w:r>
+      <w:r>
+        <w:rPr>
+          <w:rFonts w:eastAsia="Times New Roman" w:ascii="Times New Roman" w:hAnsi="Times New Roman"/>
+          <w:color w:val="000000" w:themeColor="text1"/>
+        </w:rPr>
+      </w:r>
+      <w:r>
+        <w:rPr>
+          <w:rFonts w:eastAsia="Times New Roman" w:ascii="Times New Roman" w:hAnsi="Times New Roman"/>
+          <w:color w:val="000000" w:themeColor="text1"/>
+        </w:rPr>
       </w:r>
       <w:proofErr w:type="spellStart"/>
       <w:r>
@@ -19108,7 +19100,6 @@
           <w:rFonts w:eastAsia="Times New Roman" w:ascii="Times New Roman" w:hAnsi="Times New Roman"/>
           <w:color w:val="000000" w:themeColor="text1"/>
         </w:rPr>
-        <w:t>hyperparameter</w:t>
       </w:r>
       <w:proofErr w:type="spellEnd"/>
       <w:r>
@@ -19116,7 +19107,6 @@
           <w:rFonts w:eastAsia="Times New Roman" w:ascii="Times New Roman" w:hAnsi="Times New Roman"/>
           <w:color w:val="000000" w:themeColor="text1"/>
         </w:rPr>
-        <w:t xml:space="preserve"> configurations for both models.</w:t>
       </w:r>
     </w:p>
     <w:p>
@@ -19134,7 +19124,6 @@
           <w:rFonts w:eastAsia="Times New Roman" w:ascii="Times New Roman" w:hAnsi="Times New Roman"/>
           <w:color w:val="000000" w:themeColor="text1"/>
         </w:rPr>
-        <w:t>The tuning process focuses on penalizing model complexity to prevent overfitting:</w:t>
       </w:r>
     </w:p>
     <w:p>
@@ -21599,7 +21588,7 @@
           <w:color w:val="000000"/>
           <w:sz w:val="24"/>
         </w:rPr>
-        <w:t>4.  Passive NGX Pension Index Buy-and-Hold: Evaluates the broad market equity index, tracking real-world institutional equity performance on the Nigerian Exchange.</w:t>
+        <w:t>4.  Passive NGX Pension Index Buy-and-Hold: A market proxy constructed from the 28 sample equities, initialized at equal weights (w_i = 1/N) at inception and left to drift passively with asset price returns, with zero rebalancing thereafter. Note that this benchmark proxies broad market performance using the study sample, and is not the official NGX Pension Index series.</w:t>
       </w:r>
     </w:p>
     <w:p>

</xml_diff>

<commit_message>
docs: finalize gamma placement, add DeMiguel (2009) to references, and convert raw LaTeX to unicode typography
</commit_message>
<xml_diff>
--- a/Abdulameen Chapter 1 -3.docx
+++ b/Abdulameen Chapter 1 -3.docx
@@ -1770,8 +1770,7 @@
         <w:t xml:space="preserve">This study investigates the econometric viability and economic performance of integrating non-linear machine learning return forecasting models with convex Conditional Value-at-Risk (CVaR) portfolio optimization on the Nigerian Exchange Group (NGX). Classical portfolio selection models rooted in Markowitz Mean-Variance Optimization (MVO) operate under the restrictive assumption of Gaussian return distributions and quadratic variance, exposing emerging market investors to severe estimation risk and catastrophic left-tail drawdowns. To address these structural deficiencies, this research deploys a robust quantitative framework evaluating 28 liquid equities from the NGX Pension Index spanning a clean 16-year historical panel from January 2010 through December 2025 (835 weekly observations per asset). Thirteen volume-confirmed technical indicators and autoregressive momentum features were engineered to capture non-linear market interactions without look-ahead bias. Using an Expanding-Window Walk-Forward Validation protocol with 5-fold TimeSeriesSplit cross-validation, Random Forest and eXtreme Gradient Boosting (XGBoost) algorithms were trained and refit quarterly across an out-of-sample test horizon (2021–2025). The resulting dynamic expected return forecasts were incorporated into a coherent linear programming Mean-CVaR optimization model and evaluated against classical MVO, naive 1/N equal weighting, and passive market buy-and-hold indexing across three realistic transaction cost regimes (zero friction, 0.75% institutional PFA brokerage, and 1.50% retail fees). Statistical diagnostic tests (Jarque-Bera and Shapiro-Wilk) conclusively rejected normality across all 28 assets (p &lt; 0.001), exhibiting predominantly positive skewness (cross-sectional mean = +0.54) and excess kurtosis across all 28 assets (ranging from 2.20 to 14.47 among assets unaffected by corporate actions), thereby confirming heavy-tailed, leptokurtic distributions and validating the theoretical necessity of CVaR. While raw point prediction errors (RMSE) hover close to historical </w:t>
       </w:r>
       <w:r>
-        <w:lastRenderedPageBreak/>
-        <w:t>baselines due to weekly noise variance, Diebold-Mariano tests confirm that forecast accuracy is statistically indistinguishable from historical baselines across 89.3% of assets (p &gt; 0.05). Directional accuracy averaged 38.1% for Random Forest and 37.8% for XGBoost (against 37.9% for the historical baseline across all 28 assets, where below-50% cross-sectional averages reflect zero-return weeks from forward-filling non-trading periods, while reaching 50.8% on liquid large-caps), driven primarily by the Percentage Price Oscillator, Relative Strength Index, and On-Balance Volume. Under zero fee friction, XGBoost + Mean-CVaR achieved a superior gross Sharpe ratio of 1.52 (42.00% annualized return, -22.09% maximum drawdown) compared to 0.91 for the market index and 0.76 for MVO (unadjusted Ledoit-Wolf circular block bootstrap p = 0.015, marginal after Benjamini–Hochberg FDR correction at q = 0.056 across 18 simultaneous comparisons; +819 basis points Certainty Equivalent Return welfare gain). Crucially, transaction cost sensitivity analysis reveals that the structural CVaR architecture delivers the robustly significant result: under institutional fees, XGB-CVaR's weekly turnover (11.00%) incurs an annual fee drag that renders it significantly inferior to static Historical-CVaR (Sharpe diff -0.25, FDR q = 0.000), while unconstrained MVO collapses under turnover drag (-86.38% drawdown, −64.09% CER utility). Low-turnover Historical-CVaR (0.38% weekly turnover) maintains resilient net Sharpe ratios of 1.48 (retail) and 1.49 (institutional). These findings demonstrate that structural tail-risk architecture (CVaR) plays a far more critical role than predictive model complexity in real-world emerging market wealth preservation. Here γ = 3.0 is the risk-aversion coefficient, consistent with the MVO utility specification.</w:t>
+        <w:t>baselines due to weekly noise variance, Diebold-Mariano tests confirm that forecast accuracy is statistically indistinguishable from historical baselines across 89.3% of assets (p &gt; 0.05). Directional accuracy averaged 38.1% for Random Forest and 37.8% for XGBoost (against 37.9% for the historical baseline across all 28 assets, where below-50% cross-sectional averages reflect zero-return weeks from forward-filling non-trading periods, while reaching 50.8% on liquid large-caps), driven primarily by the Percentage Price Oscillator, Relative Strength Index, and On-Balance Volume. Under zero fee friction, XGBoost + Mean-CVaR achieved a superior gross Sharpe ratio of 1.52 (42.00% annualized return, -22.09% maximum drawdown) compared to 0.91 for the market index and 0.76 for MVO (unadjusted Ledoit-Wolf circular block bootstrap p = 0.015, marginal after Benjamini–Hochberg FDR correction at q = 0.056 across 18 simultaneous comparisons; +819 basis points Certainty Equivalent Return welfare gain). Crucially, transaction cost sensitivity analysis reveals that the structural CVaR architecture delivers the robustly significant result: under institutional fees, XGB-CVaR's weekly turnover (11.00%) incurs an annual fee drag that renders it significantly inferior to static Historical-CVaR (Sharpe diff -0.25, FDR q = 0.000), while unconstrained MVO collapses under turnover drag (-86.38% drawdown, −64.09% CER utility). Low-turnover Historical-CVaR (0.38% weekly turnover) maintains resilient net Sharpe ratios of 1.48 (retail) and 1.49 (institutional). These findings demonstrate that structural tail-risk architecture (CVaR) plays a far more critical role than predictive model complexity in real-world emerging market wealth preservation.</w:t>
       </w:r>
     </w:p>
     <w:p>
@@ -9535,8 +9534,7 @@
         </w:rPr>
       </w:pPr>
       <w:r>
-        <w:lastRenderedPageBreak/>
-        <w:t>To provide the machine learning algorithms with a comprehensive representation of market conditions, the feature space is populated with thirteen explicitly selected variables. These variables are derived entirely from the historical Open, High, Low, Close, and Volume (OHLCV) data to capture diverse market dimensions. The feature vector X_t is mathematically defined as a column vector containing the technical momentum, trend, volatility, and volume indicators alongside historical autoregressive return lags.</w:t>
+        <w:t>To provide the machine learning algorithms with a comprehensive representation of market conditions, the feature space is populated with thirteen explicitly selected variables. These variables are derived entirely from the historical Open, High, Low, Close, and Volume (OHLCV) data to capture diverse market dimensions. The feature vector Xₜ is mathematically defined as a column vector containing the technical momentum, trend, volatility, and volume indicators alongside historical autoregressive return lags.</w:t>
       </w:r>
     </w:p>
     <w:p>
@@ -10399,7 +10397,7 @@
         </w:rPr>
       </w:pPr>
       <w:r>
-        <w:t>Autoregressive (Lagged) Returns: The sequence of R_{i,t}, R_{i,t-1}, R_{i,t-2}, and R_{i,t-3} represents the four most recent weekly logarithmic returns available at prediction time t, feeding historical price momentum directly into the machine learning algorithms.</w:t>
+        <w:t>Autoregressive (Lagged) Returns: The sequence of Rᵢ,ₜ, Rᵢ,ₜ₋₁, Rᵢ,ₜ₋₂, and Rᵢ,ₜ₋₃ represents the four most recent weekly logarithmic returns available at prediction time t, feeding historical price momentum directly into the machine learning algorithms.</w:t>
       </w:r>
     </w:p>
     <w:p>
@@ -18768,11 +18766,10 @@
         </w:rPr>
       </w:pPr>
       <w:r>
-        <w:t xml:space="preserve">To ensure that the optimized Mean-CVaR portfolio strategy is economically viable and not merely theoretically profitable, it is imperative to account for real-world trading frictions, such as brokerage fees and slippage on the Nigerian Exchange Group (NGX) (Ashrafzadeh et al., 2025). This requires measuring portfolio turnover, which quantifies the absolute change in asset weights from one weekly rebalancing period to the next (Zsurkis et al., 2024). Total rebalancing transaction </w:t>
-      </w:r>
-      <w:r>
-        <w:lastRenderedPageBreak/>
-        <w:t>costs at week t are mathematically defined as Cost_t = c × ∑ |w_{i,t} - w_{i,t-1}|, where c denotes the proportional transaction fee rate. This study evaluates portfolio performance across three execution friction regimes: a frictionless gross baseline (c = 0.00%), an institutional PFA brokerage scenario (c = 0.75%), and a retail investor friction scenario (c = 1.50%). Net portfolio returns are constructed by deducting these calculated transaction costs from gross returns at each weekly rebalancing step.</w:t>
+        <w:t xml:space="preserve">To ensure that the optimized Mean−CVaR portfolio strategy is economically viable and not merely theoretically profitable, it is imperative to account for real−world trading frictions, such as brokerage fees and slippage on the Nigerian Exchange Group (NGX) (Ashrafzadeh et al., 2025). This requires measuring portfolio turnover, which quantifies the absolute change in asset weights from one weekly rebalancing period to the next (Zsurkis et al., 2024). Total rebalancing transaction </w:t>
+      </w:r>
+      <w:r>
+        <w:t>costs at week t are mathematically defined as Costₜ = c × ∑ |wᵢ,ₜ − wᵢ,ₜ₋₁|, where c denotes the proportional transaction fee rate. This study evaluates portfolio performance across three execution friction regimes: a frictionless gross baseline (c = 0.00%), an institutional PFA brokerage scenario (c = 0.75%), and a retail investor friction scenario (c = 1.50%). Net portfolio returns are constructed by deducting these calculated transaction costs from gross returns at each weekly rebalancing step.</w:t>
       </w:r>
     </w:p>
     <w:p>
@@ -20800,6 +20797,21 @@
           </m:sSup>
         </m:oMath>
       </m:oMathPara>
+    </w:p>
+    <w:p>
+      <w:pPr>
+        <w:spacing w:line="480" w:lineRule="auto" w:before="0" w:after="0"/>
+        <w:ind w:firstLine="720"/>
+        <w:jc w:val="both"/>
+      </w:pPr>
+      <w:r>
+        <w:rPr>
+          <w:rFonts w:ascii="Times New Roman" w:hAnsi="Times New Roman"/>
+          <w:color w:val="000000"/>
+          <w:sz w:val="24"/>
+        </w:rPr>
+        <w:t>Here γ = 3.0 is the risk-aversion coefficient, consistent with the MVO utility specification.</w:t>
+      </w:r>
     </w:p>
     <w:p>
       <w:pPr>
@@ -21267,7 +21279,7 @@
         <w:jc w:val="both"/>
       </w:pPr>
       <w:r>
-        <w:t>3.  Naive 1/N Equal Weighting: Allocates equal capital (w_i = 1/28 ≈ 3.57%) across all eligible assets without parameter estimation or optimization, serving as the canonical DeMiguel et al. (2009) benchmark.</w:t>
+        <w:t>3.  Naive 1/N Equal Weighting: Allocates equal capital (wᵢ = 1/28 ≈ 3.57%) across all eligible assets without parameter estimation or optimization, serving as the canonical DeMiguel et al. (2009) benchmark.</w:t>
       </w:r>
     </w:p>
     <w:p>
@@ -21277,7 +21289,7 @@
         <w:jc w:val="both"/>
       </w:pPr>
       <w:r>
-        <w:t>4.  Passive NGX Pension Index Buy-and-Hold: A market proxy constructed from the 28 sample equities, initialized at equal weights (w_i = 1/N) at inception and left to drift passively with asset price returns, with zero rebalancing thereafter. Note that this benchmark proxies broad market performance using the study sample, and is not the official NGX Pension Index series.</w:t>
+        <w:t>4.  Passive NGX Pension Index Buy-and-Hold: A market proxy constructed from the 28 sample equities, initialized at equal weights (wᵢ = 1/N) at inception and left to drift passively with asset price returns, with zero rebalancing thereafter. Note that this benchmark proxies broad market performance using the study sample, and is not the official NGX Pension Index series.</w:t>
       </w:r>
     </w:p>
     <w:p>
@@ -25376,7 +25388,7 @@
         </w:rPr>
       </w:pPr>
       <w:r>
-        <w:t>Prior to feeding the financial time-series data into the machine learning models, rigorous data preprocessing was conducted to ensure data integrity. First, missing values arising from market holidays or trading halts were handled using forward-fill (P_t = P_{t-1} ⇒ R_t = 0), producing zero-return weeks without synthetic statistical imputation of unlisted history. Second, Min-Max normalization was applied to scale all features onto [0, 1] within each expanding training fold to prevent numerical instability. While decision tree partitions are invariant to monotonic scaling, normalization standardizes inputs across diverse technical indicators.</w:t>
+        <w:t>Prior to feeding the financial time-series data into the machine learning models, rigorous data preprocessing was conducted to ensure data integrity. First, missing values arising from market holidays or trading halts were handled using forward-fill (Pₜ = Pₜ₋₁ ⇒ Rₜ = 0), producing zero-return weeks without synthetic statistical imputation of unlisted history. Second, Min-Max normalization was applied to scale all features onto [0, 1] within each expanding training fold to prevent numerical instability. While decision tree partitions are invariant to monotonic scaling, normalization standardizes inputs across diverse technical indicators.</w:t>
       </w:r>
     </w:p>
     <w:p>

</xml_diff>